<commit_message>
Updating the Theme and Logo for Better User Experience
</commit_message>
<xml_diff>
--- a/UIUX Designs/ConnectVista Data.docx
+++ b/UIUX Designs/ConnectVista Data.docx
@@ -4,100 +4,274 @@
   <w:body>
     <w:p>
       <w:r>
-        <w:t>Tables For ConnectVista Project</w:t>
-      </w:r>
-    </w:p>
-    <w:p>
-      <w:r>
-        <w:t>1) User  {id</w:t>
-      </w:r>
-      <w:r>
-        <w:t>, email, Phone, Password, Role}</w:t>
-      </w:r>
-    </w:p>
-    <w:p>
-      <w:r>
-        <w:t xml:space="preserve">2) ServiceSeeker  {id, Name, Gender, </w:t>
-      </w:r>
-      <w:r>
-        <w:t>Address, City, State, Pin Code}</w:t>
-      </w:r>
-    </w:p>
-    <w:p>
-      <w:r>
-        <w:t>3) FavoriteServiceProvider {id, ProviderID} {fetch other details like name, bus</w:t>
-      </w:r>
-      <w:r>
-        <w:t>iness name, category from join}</w:t>
-      </w:r>
-    </w:p>
-    <w:p>
-      <w:r>
-        <w:t>4) ServiceProvider {id, Name, Business Name, Business Images, Description about Business and provider, Service Category, Services Offered, Specialization, Experience in Years, Business Address, City, State, Pin Code, Languages, Ratings, Starting Price, Emergency Service Charge, Extra Charges(ac</w:t>
-      </w:r>
-      <w:r>
-        <w:t>cording to the need of seeker)}</w:t>
-      </w:r>
-    </w:p>
-    <w:p>
-      <w:r>
-        <w:t>5) ProviderSchedule {id, Response Time, Service Area, Time Table(whole week time de</w:t>
-      </w:r>
-      <w:r>
-        <w:t>tails + work off day updation)}</w:t>
-      </w:r>
-    </w:p>
-    <w:p>
-      <w:r>
-        <w:t>6) Services {id, Name, Description, Available Providers, Starts</w:t>
-      </w:r>
-      <w:r>
-        <w:t xml:space="preserve"> at[Pricing], Ratings, Reviews}</w:t>
-      </w:r>
-    </w:p>
-    <w:p>
-      <w:r>
-        <w:t>7) ProviderV</w:t>
-      </w:r>
-      <w:r>
-        <w:t>erification {id, 3 DOC, Status}</w:t>
-      </w:r>
-    </w:p>
-    <w:p>
-      <w:r>
-        <w:t>8) Booking {id, SeekerID, ProviderID, Service, Date, Time, Priority (urgent then extra charge 5-10%), service address(if same as seeker address then choose tick mark), Additional Note, Cost Details, status}</w:t>
-      </w:r>
-      <w:r>
-        <w:t xml:space="preserve"> {for both Seeker and Provider}</w:t>
-      </w:r>
-    </w:p>
-    <w:p>
-      <w:r>
-        <w:t>9) Reviews {id, SeekerID, ProviderID, Rating, Reviews, Like to Review, Reply From Provider, Stat</w:t>
-      </w:r>
-      <w:r>
-        <w:t>us(read or unread by provider)}</w:t>
-      </w:r>
-    </w:p>
-    <w:p>
-      <w:r>
-        <w:t>10) Notification {id, UserID, Message, Status, Category(booking, system etc)} {also there may be 2 ids from provider to seeker or seeker to prov</w:t>
-      </w:r>
-      <w:r>
-        <w:t>ider realted to booking}</w:t>
-      </w:r>
-    </w:p>
-    <w:p>
-      <w:r>
-        <w:t>11) Subscripti</w:t>
-      </w:r>
-      <w:r>
-        <w:t>on {id, ProviderID, Plan, ....}</w:t>
-      </w:r>
-    </w:p>
-    <w:p>
-      <w:r>
-        <w:t>may be some remaining like ProviderSettings, Profiles setting for both</w:t>
+        <w:t xml:space="preserve">Tables </w:t>
+      </w:r>
+      <w:proofErr w:type="gramStart"/>
+      <w:r>
+        <w:t>For</w:t>
+      </w:r>
+      <w:proofErr w:type="gramEnd"/>
+      <w:r>
+        <w:t xml:space="preserve"> </w:t>
+      </w:r>
+      <w:proofErr w:type="spellStart"/>
+      <w:r>
+        <w:t>ConnectVista</w:t>
+      </w:r>
+      <w:proofErr w:type="spellEnd"/>
+      <w:r>
+        <w:t xml:space="preserve"> Project</w:t>
+      </w:r>
+    </w:p>
+    <w:p>
+      <w:r>
+        <w:t xml:space="preserve">1) </w:t>
+      </w:r>
+      <w:proofErr w:type="gramStart"/>
+      <w:r>
+        <w:t>User  {</w:t>
+      </w:r>
+      <w:proofErr w:type="gramEnd"/>
+      <w:r>
+        <w:t>id, email, Phone, Password, Role}</w:t>
+      </w:r>
+    </w:p>
+    <w:p>
+      <w:r>
+        <w:t xml:space="preserve">2) </w:t>
+      </w:r>
+      <w:proofErr w:type="spellStart"/>
+      <w:proofErr w:type="gramStart"/>
+      <w:r>
+        <w:t>ServiceSeeker</w:t>
+      </w:r>
+      <w:proofErr w:type="spellEnd"/>
+      <w:r>
+        <w:t xml:space="preserve">  {</w:t>
+      </w:r>
+      <w:proofErr w:type="gramEnd"/>
+      <w:r>
+        <w:t>id, Name, Gender, Address, City, State, Pin Code}</w:t>
+      </w:r>
+    </w:p>
+    <w:p>
+      <w:r>
+        <w:t xml:space="preserve">3) </w:t>
+      </w:r>
+      <w:proofErr w:type="spellStart"/>
+      <w:r>
+        <w:t>FavoriteServiceProvider</w:t>
+      </w:r>
+      <w:proofErr w:type="spellEnd"/>
+      <w:r>
+        <w:t xml:space="preserve"> {id, </w:t>
+      </w:r>
+      <w:proofErr w:type="spellStart"/>
+      <w:r>
+        <w:t>ProviderID</w:t>
+      </w:r>
+      <w:proofErr w:type="spellEnd"/>
+      <w:r>
+        <w:t>} {fetch other details like name, business name, category from join}</w:t>
+      </w:r>
+    </w:p>
+    <w:p>
+      <w:r>
+        <w:t xml:space="preserve">4) </w:t>
+      </w:r>
+      <w:proofErr w:type="spellStart"/>
+      <w:r>
+        <w:t>ServiceProvider</w:t>
+      </w:r>
+      <w:proofErr w:type="spellEnd"/>
+      <w:r>
+        <w:t xml:space="preserve"> {id, Name, Business Name, Business Images, Description about Business and provider, Service Category, Services Offered, Specialization, Experience in Years, Business Address, City, State, Pin Code, Languages, Ratings, Starting Price, Emergency Service Charge, Extra Charges(according to the need of seeker)}</w:t>
+      </w:r>
+    </w:p>
+    <w:p>
+      <w:r>
+        <w:t xml:space="preserve">5) </w:t>
+      </w:r>
+      <w:proofErr w:type="spellStart"/>
+      <w:r>
+        <w:t>ProviderSchedule</w:t>
+      </w:r>
+      <w:proofErr w:type="spellEnd"/>
+      <w:r>
+        <w:t xml:space="preserve"> {id, Response Time, Service Area, Time </w:t>
+      </w:r>
+      <w:proofErr w:type="gramStart"/>
+      <w:r>
+        <w:t>Table(</w:t>
+      </w:r>
+      <w:proofErr w:type="gramEnd"/>
+      <w:r>
+        <w:t xml:space="preserve">whole week time details + work off day </w:t>
+      </w:r>
+      <w:proofErr w:type="spellStart"/>
+      <w:r>
+        <w:t>updation</w:t>
+      </w:r>
+      <w:proofErr w:type="spellEnd"/>
+      <w:r>
+        <w:t>)}</w:t>
+      </w:r>
+    </w:p>
+    <w:p>
+      <w:r>
+        <w:t xml:space="preserve">6) Services {id, Name, Description, Available Providers, Starts </w:t>
+      </w:r>
+      <w:proofErr w:type="gramStart"/>
+      <w:r>
+        <w:t>at[</w:t>
+      </w:r>
+      <w:proofErr w:type="gramEnd"/>
+      <w:r>
+        <w:t>Pricing], Ratings, Reviews}</w:t>
+      </w:r>
+    </w:p>
+    <w:p>
+      <w:r>
+        <w:t xml:space="preserve">7) </w:t>
+      </w:r>
+      <w:proofErr w:type="spellStart"/>
+      <w:r>
+        <w:t>ProviderVerification</w:t>
+      </w:r>
+      <w:proofErr w:type="spellEnd"/>
+      <w:r>
+        <w:t xml:space="preserve"> {id, 3 DOC, Status}</w:t>
+      </w:r>
+    </w:p>
+    <w:p>
+      <w:r>
+        <w:t xml:space="preserve">8) Booking {id, </w:t>
+      </w:r>
+      <w:proofErr w:type="spellStart"/>
+      <w:r>
+        <w:t>SeekerID</w:t>
+      </w:r>
+      <w:proofErr w:type="spellEnd"/>
+      <w:r>
+        <w:t xml:space="preserve">, </w:t>
+      </w:r>
+      <w:proofErr w:type="spellStart"/>
+      <w:r>
+        <w:t>ProviderID</w:t>
+      </w:r>
+      <w:proofErr w:type="spellEnd"/>
+      <w:r>
+        <w:t xml:space="preserve">, Service, Date, Time, Priority (urgent then extra charge 5-10%), service </w:t>
+      </w:r>
+      <w:proofErr w:type="gramStart"/>
+      <w:r>
+        <w:t>address(</w:t>
+      </w:r>
+      <w:proofErr w:type="gramEnd"/>
+      <w:r>
+        <w:t>if same as seeker address then choose tick mark), Additional Note, Cost Details, status} {for both Seeker and Provider}</w:t>
+      </w:r>
+    </w:p>
+    <w:p>
+      <w:r>
+        <w:t xml:space="preserve">9) Reviews {id, </w:t>
+      </w:r>
+      <w:proofErr w:type="spellStart"/>
+      <w:r>
+        <w:t>SeekerID</w:t>
+      </w:r>
+      <w:proofErr w:type="spellEnd"/>
+      <w:r>
+        <w:t xml:space="preserve">, </w:t>
+      </w:r>
+      <w:proofErr w:type="spellStart"/>
+      <w:r>
+        <w:t>ProviderID</w:t>
+      </w:r>
+      <w:proofErr w:type="spellEnd"/>
+      <w:r>
+        <w:t xml:space="preserve">, Rating, Reviews, Like to Review, Reply From Provider, </w:t>
+      </w:r>
+      <w:proofErr w:type="gramStart"/>
+      <w:r>
+        <w:t>Status(</w:t>
+      </w:r>
+      <w:proofErr w:type="gramEnd"/>
+      <w:r>
+        <w:t>read or unread by provider)}</w:t>
+      </w:r>
+    </w:p>
+    <w:p>
+      <w:r>
+        <w:t xml:space="preserve">10) Notification {id, </w:t>
+      </w:r>
+      <w:proofErr w:type="spellStart"/>
+      <w:r>
+        <w:t>UserID</w:t>
+      </w:r>
+      <w:proofErr w:type="spellEnd"/>
+      <w:r>
+        <w:t xml:space="preserve">, Message, Status, </w:t>
+      </w:r>
+      <w:proofErr w:type="gramStart"/>
+      <w:r>
+        <w:t>Category(</w:t>
+      </w:r>
+      <w:proofErr w:type="gramEnd"/>
+      <w:r>
+        <w:t xml:space="preserve">booking, system </w:t>
+      </w:r>
+      <w:proofErr w:type="spellStart"/>
+      <w:r>
+        <w:t>etc</w:t>
+      </w:r>
+      <w:proofErr w:type="spellEnd"/>
+      <w:r>
+        <w:t xml:space="preserve">)} {also there may be 2 ids from provider to seeker or seeker to provider </w:t>
+      </w:r>
+      <w:proofErr w:type="spellStart"/>
+      <w:r>
+        <w:t>realted</w:t>
+      </w:r>
+      <w:proofErr w:type="spellEnd"/>
+      <w:r>
+        <w:t xml:space="preserve"> to booking}</w:t>
+      </w:r>
+    </w:p>
+    <w:p>
+      <w:r>
+        <w:t xml:space="preserve">11) Subscription {id, </w:t>
+      </w:r>
+      <w:proofErr w:type="spellStart"/>
+      <w:r>
+        <w:t>ProviderID</w:t>
+      </w:r>
+      <w:proofErr w:type="spellEnd"/>
+      <w:r>
+        <w:t xml:space="preserve">, </w:t>
+      </w:r>
+      <w:proofErr w:type="gramStart"/>
+      <w:r>
+        <w:t>Plan, ....}</w:t>
+      </w:r>
+      <w:proofErr w:type="gramEnd"/>
+    </w:p>
+    <w:p>
+      <w:proofErr w:type="gramStart"/>
+      <w:r>
+        <w:t>may</w:t>
+      </w:r>
+      <w:proofErr w:type="gramEnd"/>
+      <w:r>
+        <w:t xml:space="preserve"> be some remaining like </w:t>
+      </w:r>
+      <w:proofErr w:type="spellStart"/>
+      <w:r>
+        <w:t>ProviderSettings</w:t>
+      </w:r>
+      <w:proofErr w:type="spellEnd"/>
+      <w:r>
+        <w:t>, Profiles setting for both</w:t>
       </w:r>
     </w:p>
     <w:p/>
@@ -123,27 +297,28 @@
           <w:bCs/>
         </w:rPr>
         <w:lastRenderedPageBreak/>
-        <w:t>1️</w:t>
-      </w:r>
-      <w:r>
-        <w:rPr>
-          <w:rFonts w:ascii="Tahoma" w:hAnsi="Tahoma" w:cs="Tahoma"/>
-          <w:b/>
-          <w:bCs/>
-        </w:rPr>
-        <w:t>⃣</w:t>
-      </w:r>
-      <w:r>
-        <w:rPr>
-          <w:b/>
-          <w:bCs/>
-        </w:rPr>
-        <w:t xml:space="preserve"> User</w:t>
-      </w:r>
-    </w:p>
-    <w:p>
-      <w:r>
-        <w:t>User {id, email, phone, password, role, is_active, created_at}</w:t>
+        <w:t>User</w:t>
+      </w:r>
+    </w:p>
+    <w:p>
+      <w:r>
+        <w:t xml:space="preserve">User {id, email, phone, password, role, </w:t>
+      </w:r>
+      <w:proofErr w:type="spellStart"/>
+      <w:r>
+        <w:t>is_active</w:t>
+      </w:r>
+      <w:proofErr w:type="spellEnd"/>
+      <w:r>
+        <w:t xml:space="preserve">, </w:t>
+      </w:r>
+      <w:proofErr w:type="spellStart"/>
+      <w:r>
+        <w:t>created_at</w:t>
+      </w:r>
+      <w:proofErr w:type="spellEnd"/>
+      <w:r>
+        <w:t>}</w:t>
       </w:r>
       <w:r>
         <w:br/>
@@ -188,7 +363,23 @@
       </w:r>
       <w:r>
         <w:br/>
-        <w:t>Referenced by → ServiceSeeker, ServiceProvider, Notification, Booking, Review</w:t>
+        <w:t xml:space="preserve">Referenced by → </w:t>
+      </w:r>
+      <w:proofErr w:type="spellStart"/>
+      <w:r>
+        <w:t>ServiceSeeker</w:t>
+      </w:r>
+      <w:proofErr w:type="spellEnd"/>
+      <w:r>
+        <w:t xml:space="preserve">, </w:t>
+      </w:r>
+      <w:proofErr w:type="spellStart"/>
+      <w:r>
+        <w:t>ServiceProvider</w:t>
+      </w:r>
+      <w:proofErr w:type="spellEnd"/>
+      <w:r>
+        <w:t>, Notification, Booking, Review</w:t>
       </w:r>
       <w:r>
         <w:br/>
@@ -209,33 +400,51 @@
           <w:bCs/>
         </w:rPr>
       </w:pPr>
-      <w:r>
-        <w:rPr>
-          <w:b/>
-          <w:bCs/>
-        </w:rPr>
-        <w:t>2️</w:t>
-      </w:r>
-      <w:r>
-        <w:rPr>
-          <w:rFonts w:ascii="Tahoma" w:hAnsi="Tahoma" w:cs="Tahoma"/>
-          <w:b/>
-          <w:bCs/>
-        </w:rPr>
-        <w:t>⃣</w:t>
-      </w:r>
-      <w:r>
-        <w:rPr>
-          <w:b/>
-          <w:bCs/>
-        </w:rPr>
-        <w:t xml:space="preserve"> ServiceSeeker</w:t>
-      </w:r>
-    </w:p>
-    <w:p>
-      <w:r>
-        <w:t>ServiceSeeker {id, user_id, name, gender, address, city, state, pin_code, created_at}</w:t>
-      </w:r>
+      <w:proofErr w:type="spellStart"/>
+      <w:r>
+        <w:rPr>
+          <w:b/>
+          <w:bCs/>
+        </w:rPr>
+        <w:t>ServiceSeeker</w:t>
+      </w:r>
+      <w:proofErr w:type="spellEnd"/>
+    </w:p>
+    <w:p>
+      <w:proofErr w:type="spellStart"/>
+      <w:r>
+        <w:t>ServiceSeeker</w:t>
+      </w:r>
+      <w:proofErr w:type="spellEnd"/>
+      <w:r>
+        <w:t xml:space="preserve"> {id, </w:t>
+      </w:r>
+      <w:proofErr w:type="spellStart"/>
+      <w:r>
+        <w:t>user_id</w:t>
+      </w:r>
+      <w:proofErr w:type="spellEnd"/>
+      <w:r>
+        <w:t xml:space="preserve">, name, gender, address, city, state, </w:t>
+      </w:r>
+      <w:proofErr w:type="spellStart"/>
+      <w:r>
+        <w:t>pin_code</w:t>
+      </w:r>
+      <w:proofErr w:type="spellEnd"/>
+      <w:r>
+        <w:t xml:space="preserve">, </w:t>
+      </w:r>
+      <w:proofErr w:type="spellStart"/>
+      <w:r>
+        <w:t>created_at</w:t>
+      </w:r>
+      <w:proofErr w:type="spellEnd"/>
+      <w:proofErr w:type="gramStart"/>
+      <w:r>
+        <w:t>}</w:t>
+      </w:r>
+      <w:proofErr w:type="gramEnd"/>
       <w:r>
         <w:br/>
         <w:t>{</w:t>
@@ -243,6 +452,7 @@
       <w:r>
         <w:br/>
       </w:r>
+      <w:proofErr w:type="spellStart"/>
       <w:r>
         <w:rPr>
           <w:b/>
@@ -250,6 +460,7 @@
         </w:rPr>
         <w:t>user_id</w:t>
       </w:r>
+      <w:proofErr w:type="spellEnd"/>
       <w:r>
         <w:t xml:space="preserve"> → FK → User.id</w:t>
       </w:r>
@@ -287,32 +498,104 @@
           <w:bCs/>
         </w:rPr>
       </w:pPr>
-      <w:r>
-        <w:rPr>
-          <w:b/>
-          <w:bCs/>
-        </w:rPr>
-        <w:t>3️</w:t>
-      </w:r>
-      <w:r>
-        <w:rPr>
-          <w:rFonts w:ascii="Tahoma" w:hAnsi="Tahoma" w:cs="Tahoma"/>
-          <w:b/>
-          <w:bCs/>
-        </w:rPr>
-        <w:t>⃣</w:t>
-      </w:r>
-      <w:r>
-        <w:rPr>
-          <w:b/>
-          <w:bCs/>
-        </w:rPr>
-        <w:t xml:space="preserve"> ServiceProvider</w:t>
-      </w:r>
-    </w:p>
-    <w:p>
-      <w:r>
-        <w:t>ServiceProvider {id, user_id, name, business_name, description, experience_years, business_address, city, state, pin_code, languages, rating, starting_price, emergency_charge, extra_charge_note, is_verified, created_at}</w:t>
+      <w:proofErr w:type="spellStart"/>
+      <w:r>
+        <w:rPr>
+          <w:b/>
+          <w:bCs/>
+        </w:rPr>
+        <w:t>ServiceProvider</w:t>
+      </w:r>
+      <w:proofErr w:type="spellEnd"/>
+    </w:p>
+    <w:p>
+      <w:proofErr w:type="spellStart"/>
+      <w:r>
+        <w:t>ServiceProvider</w:t>
+      </w:r>
+      <w:proofErr w:type="spellEnd"/>
+      <w:r>
+        <w:t xml:space="preserve"> {id, </w:t>
+      </w:r>
+      <w:proofErr w:type="spellStart"/>
+      <w:r>
+        <w:t>user_id</w:t>
+      </w:r>
+      <w:proofErr w:type="spellEnd"/>
+      <w:r>
+        <w:t xml:space="preserve">, name, </w:t>
+      </w:r>
+      <w:proofErr w:type="spellStart"/>
+      <w:r>
+        <w:t>business_name</w:t>
+      </w:r>
+      <w:proofErr w:type="spellEnd"/>
+      <w:r>
+        <w:t xml:space="preserve">, description, </w:t>
+      </w:r>
+      <w:proofErr w:type="spellStart"/>
+      <w:r>
+        <w:t>experience_years</w:t>
+      </w:r>
+      <w:proofErr w:type="spellEnd"/>
+      <w:r>
+        <w:t xml:space="preserve">, </w:t>
+      </w:r>
+      <w:proofErr w:type="spellStart"/>
+      <w:r>
+        <w:t>business_address</w:t>
+      </w:r>
+      <w:proofErr w:type="spellEnd"/>
+      <w:r>
+        <w:t xml:space="preserve">, city, state, </w:t>
+      </w:r>
+      <w:proofErr w:type="spellStart"/>
+      <w:r>
+        <w:t>pin_code</w:t>
+      </w:r>
+      <w:proofErr w:type="spellEnd"/>
+      <w:r>
+        <w:t xml:space="preserve">, languages, rating, </w:t>
+      </w:r>
+      <w:proofErr w:type="spellStart"/>
+      <w:r>
+        <w:t>starting_price</w:t>
+      </w:r>
+      <w:proofErr w:type="spellEnd"/>
+      <w:r>
+        <w:t xml:space="preserve">, </w:t>
+      </w:r>
+      <w:proofErr w:type="spellStart"/>
+      <w:r>
+        <w:t>emergency_charge</w:t>
+      </w:r>
+      <w:proofErr w:type="spellEnd"/>
+      <w:r>
+        <w:t xml:space="preserve">, </w:t>
+      </w:r>
+      <w:proofErr w:type="spellStart"/>
+      <w:r>
+        <w:t>extra_charge_note</w:t>
+      </w:r>
+      <w:proofErr w:type="spellEnd"/>
+      <w:r>
+        <w:t xml:space="preserve">, </w:t>
+      </w:r>
+      <w:proofErr w:type="spellStart"/>
+      <w:r>
+        <w:t>is_verified</w:t>
+      </w:r>
+      <w:proofErr w:type="spellEnd"/>
+      <w:r>
+        <w:t xml:space="preserve">, </w:t>
+      </w:r>
+      <w:proofErr w:type="spellStart"/>
+      <w:r>
+        <w:t>created_at</w:t>
+      </w:r>
+      <w:proofErr w:type="spellEnd"/>
+      <w:r>
+        <w:t>}</w:t>
       </w:r>
       <w:r>
         <w:br/>
@@ -321,6 +604,7 @@
       <w:r>
         <w:br/>
       </w:r>
+      <w:proofErr w:type="spellStart"/>
       <w:r>
         <w:rPr>
           <w:b/>
@@ -328,6 +612,7 @@
         </w:rPr>
         <w:t>user_id</w:t>
       </w:r>
+      <w:proofErr w:type="spellEnd"/>
       <w:r>
         <w:t xml:space="preserve"> → FK → User.id</w:t>
       </w:r>
@@ -344,7 +629,23 @@
       </w:r>
       <w:r>
         <w:br/>
-        <w:t>Used in → Booking, Reviews, ProviderSchedule, ProviderServices, Subscription</w:t>
+        <w:t xml:space="preserve">Used in → Booking, Reviews, </w:t>
+      </w:r>
+      <w:proofErr w:type="spellStart"/>
+      <w:r>
+        <w:t>ProviderSchedule</w:t>
+      </w:r>
+      <w:proofErr w:type="spellEnd"/>
+      <w:r>
+        <w:t xml:space="preserve">, </w:t>
+      </w:r>
+      <w:proofErr w:type="spellStart"/>
+      <w:r>
+        <w:t>ProviderServices</w:t>
+      </w:r>
+      <w:proofErr w:type="spellEnd"/>
+      <w:r>
+        <w:t>, Subscription</w:t>
       </w:r>
       <w:r>
         <w:br/>
@@ -365,32 +666,48 @@
           <w:bCs/>
         </w:rPr>
       </w:pPr>
-      <w:r>
-        <w:rPr>
-          <w:b/>
-          <w:bCs/>
-        </w:rPr>
-        <w:t>4️</w:t>
-      </w:r>
-      <w:r>
-        <w:rPr>
-          <w:rFonts w:ascii="Tahoma" w:hAnsi="Tahoma" w:cs="Tahoma"/>
-          <w:b/>
-          <w:bCs/>
-        </w:rPr>
-        <w:t>⃣</w:t>
-      </w:r>
-      <w:r>
-        <w:rPr>
-          <w:b/>
-          <w:bCs/>
-        </w:rPr>
-        <w:t xml:space="preserve"> FavoriteServiceProvider</w:t>
-      </w:r>
-    </w:p>
-    <w:p>
-      <w:r>
-        <w:t>FavoriteServiceProvider {id, seeker_id, provider_id, created_at}</w:t>
+      <w:proofErr w:type="spellStart"/>
+      <w:r>
+        <w:rPr>
+          <w:b/>
+          <w:bCs/>
+        </w:rPr>
+        <w:t>FavoriteServiceProvider</w:t>
+      </w:r>
+      <w:proofErr w:type="spellEnd"/>
+    </w:p>
+    <w:p>
+      <w:proofErr w:type="spellStart"/>
+      <w:r>
+        <w:t>FavoriteServiceProvider</w:t>
+      </w:r>
+      <w:proofErr w:type="spellEnd"/>
+      <w:r>
+        <w:t xml:space="preserve"> {id, </w:t>
+      </w:r>
+      <w:proofErr w:type="spellStart"/>
+      <w:r>
+        <w:t>seeker_id</w:t>
+      </w:r>
+      <w:proofErr w:type="spellEnd"/>
+      <w:r>
+        <w:t xml:space="preserve">, </w:t>
+      </w:r>
+      <w:proofErr w:type="spellStart"/>
+      <w:r>
+        <w:t>provider_id</w:t>
+      </w:r>
+      <w:proofErr w:type="spellEnd"/>
+      <w:r>
+        <w:t xml:space="preserve">, </w:t>
+      </w:r>
+      <w:proofErr w:type="spellStart"/>
+      <w:r>
+        <w:t>created_at</w:t>
+      </w:r>
+      <w:proofErr w:type="spellEnd"/>
+      <w:r>
+        <w:t>}</w:t>
       </w:r>
       <w:r>
         <w:br/>
@@ -399,6 +716,7 @@
       <w:r>
         <w:br/>
       </w:r>
+      <w:proofErr w:type="spellStart"/>
       <w:r>
         <w:rPr>
           <w:b/>
@@ -406,12 +724,14 @@
         </w:rPr>
         <w:t>seeker_id</w:t>
       </w:r>
+      <w:proofErr w:type="spellEnd"/>
       <w:r>
         <w:t xml:space="preserve"> → FK → ServiceSeeker.id</w:t>
       </w:r>
       <w:r>
         <w:br/>
       </w:r>
+      <w:proofErr w:type="spellStart"/>
       <w:r>
         <w:rPr>
           <w:b/>
@@ -419,6 +739,7 @@
         </w:rPr>
         <w:t>provider_id</w:t>
       </w:r>
+      <w:proofErr w:type="spellEnd"/>
       <w:r>
         <w:t xml:space="preserve"> → FK → ServiceProvider.id</w:t>
       </w:r>
@@ -457,29 +778,24 @@
           <w:b/>
           <w:bCs/>
         </w:rPr>
-        <w:t>5️</w:t>
-      </w:r>
-      <w:r>
-        <w:rPr>
-          <w:rFonts w:ascii="Tahoma" w:hAnsi="Tahoma" w:cs="Tahoma"/>
-          <w:b/>
-          <w:bCs/>
-        </w:rPr>
-        <w:t>⃣</w:t>
-      </w:r>
-      <w:r>
-        <w:rPr>
-          <w:b/>
-          <w:bCs/>
-        </w:rPr>
-        <w:t xml:space="preserve"> Services</w:t>
+        <w:t>Services</w:t>
       </w:r>
     </w:p>
     <w:p>
       <w:r>
         <w:lastRenderedPageBreak/>
-        <w:t>Services {id, name, description, category, is_active}</w:t>
-      </w:r>
+        <w:t xml:space="preserve">Services {id, name, description, category, </w:t>
+      </w:r>
+      <w:proofErr w:type="spellStart"/>
+      <w:r>
+        <w:t>is_active</w:t>
+      </w:r>
+      <w:proofErr w:type="spellEnd"/>
+      <w:proofErr w:type="gramStart"/>
+      <w:r>
+        <w:t>}</w:t>
+      </w:r>
+      <w:proofErr w:type="gramEnd"/>
       <w:r>
         <w:br/>
         <w:t>{</w:t>
@@ -497,7 +813,15 @@
       </w:r>
       <w:r>
         <w:br/>
-        <w:t>Used in → ProviderServices, Booking</w:t>
+        <w:t xml:space="preserve">Used in → </w:t>
+      </w:r>
+      <w:proofErr w:type="spellStart"/>
+      <w:r>
+        <w:t>ProviderServices</w:t>
+      </w:r>
+      <w:proofErr w:type="spellEnd"/>
+      <w:r>
+        <w:t>, Booking</w:t>
       </w:r>
       <w:r>
         <w:br/>
@@ -518,33 +842,59 @@
           <w:bCs/>
         </w:rPr>
       </w:pPr>
-      <w:r>
-        <w:rPr>
-          <w:b/>
-          <w:bCs/>
-        </w:rPr>
-        <w:t>6️</w:t>
-      </w:r>
-      <w:r>
-        <w:rPr>
-          <w:rFonts w:ascii="Tahoma" w:hAnsi="Tahoma" w:cs="Tahoma"/>
-          <w:b/>
-          <w:bCs/>
-        </w:rPr>
-        <w:t>⃣</w:t>
-      </w:r>
-      <w:r>
-        <w:rPr>
-          <w:b/>
-          <w:bCs/>
-        </w:rPr>
-        <w:t xml:space="preserve"> ProviderServices</w:t>
-      </w:r>
-    </w:p>
-    <w:p>
-      <w:r>
-        <w:t>ProviderServices {id, provider_id, service_id, specialization, min_price, max_price}</w:t>
-      </w:r>
+      <w:proofErr w:type="spellStart"/>
+      <w:r>
+        <w:rPr>
+          <w:b/>
+          <w:bCs/>
+        </w:rPr>
+        <w:t>ProviderServices</w:t>
+      </w:r>
+      <w:proofErr w:type="spellEnd"/>
+    </w:p>
+    <w:p>
+      <w:proofErr w:type="spellStart"/>
+      <w:r>
+        <w:t>ProviderServices</w:t>
+      </w:r>
+      <w:proofErr w:type="spellEnd"/>
+      <w:r>
+        <w:t xml:space="preserve"> {id, </w:t>
+      </w:r>
+      <w:proofErr w:type="spellStart"/>
+      <w:r>
+        <w:t>provider_id</w:t>
+      </w:r>
+      <w:proofErr w:type="spellEnd"/>
+      <w:r>
+        <w:t xml:space="preserve">, </w:t>
+      </w:r>
+      <w:proofErr w:type="spellStart"/>
+      <w:r>
+        <w:t>service_id</w:t>
+      </w:r>
+      <w:proofErr w:type="spellEnd"/>
+      <w:r>
+        <w:t xml:space="preserve">, specialization, </w:t>
+      </w:r>
+      <w:proofErr w:type="spellStart"/>
+      <w:r>
+        <w:t>min_price</w:t>
+      </w:r>
+      <w:proofErr w:type="spellEnd"/>
+      <w:r>
+        <w:t xml:space="preserve">, </w:t>
+      </w:r>
+      <w:proofErr w:type="spellStart"/>
+      <w:r>
+        <w:t>max_price</w:t>
+      </w:r>
+      <w:proofErr w:type="spellEnd"/>
+      <w:proofErr w:type="gramStart"/>
+      <w:r>
+        <w:t>}</w:t>
+      </w:r>
+      <w:proofErr w:type="gramEnd"/>
       <w:r>
         <w:br/>
         <w:t>{</w:t>
@@ -552,6 +902,7 @@
       <w:r>
         <w:br/>
       </w:r>
+      <w:proofErr w:type="spellStart"/>
       <w:r>
         <w:rPr>
           <w:b/>
@@ -559,12 +910,14 @@
         </w:rPr>
         <w:t>provider_id</w:t>
       </w:r>
+      <w:proofErr w:type="spellEnd"/>
       <w:r>
         <w:t xml:space="preserve"> → FK → ServiceProvider.id</w:t>
       </w:r>
       <w:r>
         <w:br/>
       </w:r>
+      <w:proofErr w:type="spellStart"/>
       <w:r>
         <w:rPr>
           <w:b/>
@@ -572,6 +925,7 @@
         </w:rPr>
         <w:t>service_id</w:t>
       </w:r>
+      <w:proofErr w:type="spellEnd"/>
       <w:r>
         <w:t xml:space="preserve"> → FK → Services.id</w:t>
       </w:r>
@@ -605,33 +959,51 @@
           <w:bCs/>
         </w:rPr>
       </w:pPr>
-      <w:r>
-        <w:rPr>
-          <w:b/>
-          <w:bCs/>
-        </w:rPr>
-        <w:t>7️</w:t>
-      </w:r>
-      <w:r>
-        <w:rPr>
-          <w:rFonts w:ascii="Tahoma" w:hAnsi="Tahoma" w:cs="Tahoma"/>
-          <w:b/>
-          <w:bCs/>
-        </w:rPr>
-        <w:t>⃣</w:t>
-      </w:r>
-      <w:r>
-        <w:rPr>
-          <w:b/>
-          <w:bCs/>
-        </w:rPr>
-        <w:t xml:space="preserve"> ProviderPortfolio</w:t>
-      </w:r>
-    </w:p>
-    <w:p>
-      <w:r>
-        <w:t>ProviderPortfolio {id, provider_id, image_url, created_at}</w:t>
-      </w:r>
+      <w:proofErr w:type="spellStart"/>
+      <w:r>
+        <w:rPr>
+          <w:b/>
+          <w:bCs/>
+        </w:rPr>
+        <w:t>ProviderPortfolio</w:t>
+      </w:r>
+      <w:proofErr w:type="spellEnd"/>
+    </w:p>
+    <w:p>
+      <w:proofErr w:type="spellStart"/>
+      <w:r>
+        <w:t>ProviderPortfolio</w:t>
+      </w:r>
+      <w:proofErr w:type="spellEnd"/>
+      <w:r>
+        <w:t xml:space="preserve"> {id, </w:t>
+      </w:r>
+      <w:proofErr w:type="spellStart"/>
+      <w:r>
+        <w:t>provider_id</w:t>
+      </w:r>
+      <w:proofErr w:type="spellEnd"/>
+      <w:r>
+        <w:t xml:space="preserve">, </w:t>
+      </w:r>
+      <w:proofErr w:type="spellStart"/>
+      <w:r>
+        <w:t>image_url</w:t>
+      </w:r>
+      <w:proofErr w:type="spellEnd"/>
+      <w:r>
+        <w:t xml:space="preserve">, </w:t>
+      </w:r>
+      <w:proofErr w:type="spellStart"/>
+      <w:r>
+        <w:t>created_at</w:t>
+      </w:r>
+      <w:proofErr w:type="spellEnd"/>
+      <w:proofErr w:type="gramStart"/>
+      <w:r>
+        <w:t>}</w:t>
+      </w:r>
+      <w:proofErr w:type="gramEnd"/>
       <w:r>
         <w:br/>
         <w:t>{</w:t>
@@ -639,6 +1011,7 @@
       <w:r>
         <w:br/>
       </w:r>
+      <w:proofErr w:type="spellStart"/>
       <w:r>
         <w:rPr>
           <w:b/>
@@ -646,6 +1019,7 @@
         </w:rPr>
         <w:t>provider_id</w:t>
       </w:r>
+      <w:proofErr w:type="spellEnd"/>
       <w:r>
         <w:t xml:space="preserve"> → FK → ServiceProvider.id</w:t>
       </w:r>
@@ -679,33 +1053,67 @@
           <w:bCs/>
         </w:rPr>
       </w:pPr>
-      <w:r>
-        <w:rPr>
-          <w:b/>
-          <w:bCs/>
-        </w:rPr>
-        <w:t>8️</w:t>
-      </w:r>
-      <w:r>
-        <w:rPr>
-          <w:rFonts w:ascii="Tahoma" w:hAnsi="Tahoma" w:cs="Tahoma"/>
-          <w:b/>
-          <w:bCs/>
-        </w:rPr>
-        <w:t>⃣</w:t>
-      </w:r>
-      <w:r>
-        <w:rPr>
-          <w:b/>
-          <w:bCs/>
-        </w:rPr>
-        <w:t xml:space="preserve"> ProviderSchedule</w:t>
-      </w:r>
-    </w:p>
-    <w:p>
-      <w:r>
-        <w:t>ProviderSchedule {id, provider_id, response_time, service_area_radius_km, weekly_schedule, is_available}</w:t>
-      </w:r>
+      <w:proofErr w:type="spellStart"/>
+      <w:r>
+        <w:rPr>
+          <w:b/>
+          <w:bCs/>
+        </w:rPr>
+        <w:t>ProviderSchedule</w:t>
+      </w:r>
+      <w:proofErr w:type="spellEnd"/>
+    </w:p>
+    <w:p>
+      <w:proofErr w:type="spellStart"/>
+      <w:r>
+        <w:t>ProviderSchedule</w:t>
+      </w:r>
+      <w:proofErr w:type="spellEnd"/>
+      <w:r>
+        <w:t xml:space="preserve"> {id, </w:t>
+      </w:r>
+      <w:proofErr w:type="spellStart"/>
+      <w:r>
+        <w:t>provider_id</w:t>
+      </w:r>
+      <w:proofErr w:type="spellEnd"/>
+      <w:r>
+        <w:t xml:space="preserve">, </w:t>
+      </w:r>
+      <w:proofErr w:type="spellStart"/>
+      <w:r>
+        <w:t>response_time</w:t>
+      </w:r>
+      <w:proofErr w:type="spellEnd"/>
+      <w:r>
+        <w:t xml:space="preserve">, </w:t>
+      </w:r>
+      <w:proofErr w:type="spellStart"/>
+      <w:r>
+        <w:t>service_area_radius_km</w:t>
+      </w:r>
+      <w:proofErr w:type="spellEnd"/>
+      <w:r>
+        <w:t xml:space="preserve">, </w:t>
+      </w:r>
+      <w:proofErr w:type="spellStart"/>
+      <w:r>
+        <w:t>weekly_schedule</w:t>
+      </w:r>
+      <w:proofErr w:type="spellEnd"/>
+      <w:r>
+        <w:t xml:space="preserve">, </w:t>
+      </w:r>
+      <w:proofErr w:type="spellStart"/>
+      <w:r>
+        <w:t>is_available</w:t>
+      </w:r>
+      <w:proofErr w:type="spellEnd"/>
+      <w:proofErr w:type="gramStart"/>
+      <w:r>
+        <w:t>}</w:t>
+      </w:r>
+      <w:proofErr w:type="gramEnd"/>
       <w:r>
         <w:br/>
         <w:t>{</w:t>
@@ -713,6 +1121,7 @@
       <w:r>
         <w:br/>
       </w:r>
+      <w:proofErr w:type="spellStart"/>
       <w:r>
         <w:rPr>
           <w:b/>
@@ -720,12 +1129,20 @@
         </w:rPr>
         <w:t>provider_id</w:t>
       </w:r>
+      <w:proofErr w:type="spellEnd"/>
       <w:r>
         <w:t xml:space="preserve"> → FK → ServiceProvider.id</w:t>
       </w:r>
       <w:r>
         <w:br/>
-        <w:t>weekly_schedule → JSON (Mon–Sun timing + off days)</w:t>
+      </w:r>
+      <w:proofErr w:type="spellStart"/>
+      <w:r>
+        <w:t>weekly_schedule</w:t>
+      </w:r>
+      <w:proofErr w:type="spellEnd"/>
+      <w:r>
+        <w:t xml:space="preserve"> → JSON (Mon–Sun timing + off days)</w:t>
       </w:r>
       <w:r>
         <w:br/>
@@ -757,33 +1174,67 @@
           <w:bCs/>
         </w:rPr>
       </w:pPr>
-      <w:r>
-        <w:rPr>
-          <w:b/>
-          <w:bCs/>
-        </w:rPr>
-        <w:t>9️</w:t>
-      </w:r>
-      <w:r>
-        <w:rPr>
-          <w:rFonts w:ascii="Tahoma" w:hAnsi="Tahoma" w:cs="Tahoma"/>
-          <w:b/>
-          <w:bCs/>
-        </w:rPr>
-        <w:t>⃣</w:t>
-      </w:r>
-      <w:r>
-        <w:rPr>
-          <w:b/>
-          <w:bCs/>
-        </w:rPr>
-        <w:t xml:space="preserve"> ProviderVerification</w:t>
-      </w:r>
-    </w:p>
-    <w:p>
-      <w:r>
-        <w:t>ProviderVerification {id, provider_id, document_type, document_url, status, reviewed_by, reviewed_at}</w:t>
-      </w:r>
+      <w:proofErr w:type="spellStart"/>
+      <w:r>
+        <w:rPr>
+          <w:b/>
+          <w:bCs/>
+        </w:rPr>
+        <w:t>ProviderVerification</w:t>
+      </w:r>
+      <w:proofErr w:type="spellEnd"/>
+    </w:p>
+    <w:p>
+      <w:proofErr w:type="spellStart"/>
+      <w:r>
+        <w:t>ProviderVerification</w:t>
+      </w:r>
+      <w:proofErr w:type="spellEnd"/>
+      <w:r>
+        <w:t xml:space="preserve"> {id, </w:t>
+      </w:r>
+      <w:proofErr w:type="spellStart"/>
+      <w:r>
+        <w:t>provider_id</w:t>
+      </w:r>
+      <w:proofErr w:type="spellEnd"/>
+      <w:r>
+        <w:t xml:space="preserve">, </w:t>
+      </w:r>
+      <w:proofErr w:type="spellStart"/>
+      <w:r>
+        <w:t>document_type</w:t>
+      </w:r>
+      <w:proofErr w:type="spellEnd"/>
+      <w:r>
+        <w:t xml:space="preserve">, </w:t>
+      </w:r>
+      <w:proofErr w:type="spellStart"/>
+      <w:r>
+        <w:t>document_url</w:t>
+      </w:r>
+      <w:proofErr w:type="spellEnd"/>
+      <w:r>
+        <w:t xml:space="preserve">, status, </w:t>
+      </w:r>
+      <w:proofErr w:type="spellStart"/>
+      <w:r>
+        <w:t>reviewed_by</w:t>
+      </w:r>
+      <w:proofErr w:type="spellEnd"/>
+      <w:r>
+        <w:t xml:space="preserve">, </w:t>
+      </w:r>
+      <w:proofErr w:type="spellStart"/>
+      <w:r>
+        <w:t>reviewed_at</w:t>
+      </w:r>
+      <w:proofErr w:type="spellEnd"/>
+      <w:proofErr w:type="gramStart"/>
+      <w:r>
+        <w:t>}</w:t>
+      </w:r>
+      <w:proofErr w:type="gramEnd"/>
       <w:r>
         <w:br/>
         <w:t>{</w:t>
@@ -791,6 +1242,7 @@
       <w:r>
         <w:br/>
       </w:r>
+      <w:proofErr w:type="spellStart"/>
       <w:r>
         <w:rPr>
           <w:b/>
@@ -798,12 +1250,14 @@
         </w:rPr>
         <w:t>provider_id</w:t>
       </w:r>
+      <w:proofErr w:type="spellEnd"/>
       <w:r>
         <w:t xml:space="preserve"> → FK → ServiceProvider.id</w:t>
       </w:r>
       <w:r>
         <w:br/>
       </w:r>
+      <w:proofErr w:type="spellStart"/>
       <w:r>
         <w:rPr>
           <w:b/>
@@ -811,6 +1265,7 @@
         </w:rPr>
         <w:t>reviewed_by</w:t>
       </w:r>
+      <w:proofErr w:type="spellEnd"/>
       <w:r>
         <w:t xml:space="preserve"> → FK → User.id (Admin)</w:t>
       </w:r>
@@ -847,24 +1302,106 @@
       </w:pPr>
       <w:r>
         <w:rPr>
-          <w:rFonts w:ascii="Segoe UI Symbol" w:hAnsi="Segoe UI Symbol" w:cs="Segoe UI Symbol"/>
-          <w:b/>
-          <w:bCs/>
-        </w:rPr>
-        <w:t>🔟</w:t>
-      </w:r>
-      <w:r>
-        <w:rPr>
-          <w:b/>
-          <w:bCs/>
-        </w:rPr>
-        <w:t xml:space="preserve"> Booking</w:t>
-      </w:r>
-    </w:p>
-    <w:p>
-      <w:r>
-        <w:t>Booking {id, seeker_id, provider_id, service_id, booking_date, booking_time, priority, service_address, additional_note, base_price, extra_charge, total_price, status, created_at}</w:t>
-      </w:r>
+          <w:b/>
+          <w:bCs/>
+        </w:rPr>
+        <w:t>Booking</w:t>
+      </w:r>
+    </w:p>
+    <w:p>
+      <w:r>
+        <w:t xml:space="preserve">Booking {id, </w:t>
+      </w:r>
+      <w:proofErr w:type="spellStart"/>
+      <w:r>
+        <w:t>seeker_id</w:t>
+      </w:r>
+      <w:proofErr w:type="spellEnd"/>
+      <w:r>
+        <w:t xml:space="preserve">, </w:t>
+      </w:r>
+      <w:proofErr w:type="spellStart"/>
+      <w:r>
+        <w:t>provider_id</w:t>
+      </w:r>
+      <w:proofErr w:type="spellEnd"/>
+      <w:r>
+        <w:t xml:space="preserve">, </w:t>
+      </w:r>
+      <w:proofErr w:type="spellStart"/>
+      <w:r>
+        <w:t>service_id</w:t>
+      </w:r>
+      <w:proofErr w:type="spellEnd"/>
+      <w:r>
+        <w:t xml:space="preserve">, </w:t>
+      </w:r>
+      <w:proofErr w:type="spellStart"/>
+      <w:r>
+        <w:t>booking_date</w:t>
+      </w:r>
+      <w:proofErr w:type="spellEnd"/>
+      <w:r>
+        <w:t xml:space="preserve">, </w:t>
+      </w:r>
+      <w:proofErr w:type="spellStart"/>
+      <w:r>
+        <w:t>booking_time</w:t>
+      </w:r>
+      <w:proofErr w:type="spellEnd"/>
+      <w:r>
+        <w:t xml:space="preserve">, priority, </w:t>
+      </w:r>
+      <w:proofErr w:type="spellStart"/>
+      <w:r>
+        <w:t>service_address</w:t>
+      </w:r>
+      <w:proofErr w:type="spellEnd"/>
+      <w:r>
+        <w:t xml:space="preserve">, </w:t>
+      </w:r>
+      <w:proofErr w:type="spellStart"/>
+      <w:r>
+        <w:t>additional_note</w:t>
+      </w:r>
+      <w:proofErr w:type="spellEnd"/>
+      <w:r>
+        <w:t xml:space="preserve">, </w:t>
+      </w:r>
+      <w:proofErr w:type="spellStart"/>
+      <w:r>
+        <w:t>base_price</w:t>
+      </w:r>
+      <w:proofErr w:type="spellEnd"/>
+      <w:r>
+        <w:t xml:space="preserve">, </w:t>
+      </w:r>
+      <w:proofErr w:type="spellStart"/>
+      <w:r>
+        <w:t>extra_charge</w:t>
+      </w:r>
+      <w:proofErr w:type="spellEnd"/>
+      <w:r>
+        <w:t xml:space="preserve">, </w:t>
+      </w:r>
+      <w:proofErr w:type="spellStart"/>
+      <w:r>
+        <w:t>total_price</w:t>
+      </w:r>
+      <w:proofErr w:type="spellEnd"/>
+      <w:r>
+        <w:t xml:space="preserve">, status, </w:t>
+      </w:r>
+      <w:proofErr w:type="spellStart"/>
+      <w:r>
+        <w:t>created_at</w:t>
+      </w:r>
+      <w:proofErr w:type="spellEnd"/>
+      <w:proofErr w:type="gramStart"/>
+      <w:r>
+        <w:t>}</w:t>
+      </w:r>
+      <w:proofErr w:type="gramEnd"/>
       <w:r>
         <w:br/>
         <w:t>{</w:t>
@@ -872,6 +1409,7 @@
       <w:r>
         <w:br/>
       </w:r>
+      <w:proofErr w:type="spellStart"/>
       <w:r>
         <w:rPr>
           <w:b/>
@@ -879,12 +1417,14 @@
         </w:rPr>
         <w:t>seeker_id</w:t>
       </w:r>
+      <w:proofErr w:type="spellEnd"/>
       <w:r>
         <w:t xml:space="preserve"> → FK → ServiceSeeker.id</w:t>
       </w:r>
       <w:r>
         <w:br/>
       </w:r>
+      <w:proofErr w:type="spellStart"/>
       <w:r>
         <w:rPr>
           <w:b/>
@@ -892,12 +1432,14 @@
         </w:rPr>
         <w:t>provider_id</w:t>
       </w:r>
+      <w:proofErr w:type="spellEnd"/>
       <w:r>
         <w:t xml:space="preserve"> → FK → ServiceProvider.id</w:t>
       </w:r>
       <w:r>
         <w:br/>
       </w:r>
+      <w:proofErr w:type="spellStart"/>
       <w:r>
         <w:rPr>
           <w:b/>
@@ -905,6 +1447,7 @@
         </w:rPr>
         <w:t>service_id</w:t>
       </w:r>
+      <w:proofErr w:type="spellEnd"/>
       <w:r>
         <w:t xml:space="preserve"> → FK → Services.id</w:t>
       </w:r>
@@ -943,43 +1486,71 @@
           <w:b/>
           <w:bCs/>
         </w:rPr>
-        <w:t>1️</w:t>
-      </w:r>
-      <w:r>
-        <w:rPr>
-          <w:rFonts w:ascii="Tahoma" w:hAnsi="Tahoma" w:cs="Tahoma"/>
-          <w:b/>
-          <w:bCs/>
-        </w:rPr>
-        <w:t>⃣</w:t>
-      </w:r>
-      <w:r>
-        <w:rPr>
-          <w:b/>
-          <w:bCs/>
-        </w:rPr>
-        <w:t>1️</w:t>
-      </w:r>
-      <w:r>
-        <w:rPr>
-          <w:rFonts w:ascii="Tahoma" w:hAnsi="Tahoma" w:cs="Tahoma"/>
-          <w:b/>
-          <w:bCs/>
-        </w:rPr>
-        <w:t>⃣</w:t>
-      </w:r>
-      <w:r>
-        <w:rPr>
-          <w:b/>
-          <w:bCs/>
-        </w:rPr>
-        <w:t xml:space="preserve"> Reviews</w:t>
-      </w:r>
-    </w:p>
-    <w:p>
-      <w:r>
-        <w:t>Reviews {id, booking_id, seeker_id, provider_id, rating, review_text, liked, provider_reply, is_read, created_at}</w:t>
-      </w:r>
+        <w:t>Reviews</w:t>
+      </w:r>
+    </w:p>
+    <w:p>
+      <w:r>
+        <w:t xml:space="preserve">Reviews {id, </w:t>
+      </w:r>
+      <w:proofErr w:type="spellStart"/>
+      <w:r>
+        <w:t>booking_id</w:t>
+      </w:r>
+      <w:proofErr w:type="spellEnd"/>
+      <w:r>
+        <w:t xml:space="preserve">, </w:t>
+      </w:r>
+      <w:proofErr w:type="spellStart"/>
+      <w:r>
+        <w:t>seeker_id</w:t>
+      </w:r>
+      <w:proofErr w:type="spellEnd"/>
+      <w:r>
+        <w:t xml:space="preserve">, </w:t>
+      </w:r>
+      <w:proofErr w:type="spellStart"/>
+      <w:r>
+        <w:t>provider_id</w:t>
+      </w:r>
+      <w:proofErr w:type="spellEnd"/>
+      <w:r>
+        <w:t xml:space="preserve">, rating, </w:t>
+      </w:r>
+      <w:proofErr w:type="spellStart"/>
+      <w:r>
+        <w:t>review_text</w:t>
+      </w:r>
+      <w:proofErr w:type="spellEnd"/>
+      <w:r>
+        <w:t xml:space="preserve">, liked, </w:t>
+      </w:r>
+      <w:proofErr w:type="spellStart"/>
+      <w:r>
+        <w:t>provider_reply</w:t>
+      </w:r>
+      <w:proofErr w:type="spellEnd"/>
+      <w:r>
+        <w:t xml:space="preserve">, </w:t>
+      </w:r>
+      <w:proofErr w:type="spellStart"/>
+      <w:r>
+        <w:t>is_read</w:t>
+      </w:r>
+      <w:proofErr w:type="spellEnd"/>
+      <w:r>
+        <w:t xml:space="preserve">, </w:t>
+      </w:r>
+      <w:proofErr w:type="spellStart"/>
+      <w:r>
+        <w:t>created_at</w:t>
+      </w:r>
+      <w:proofErr w:type="spellEnd"/>
+      <w:proofErr w:type="gramStart"/>
+      <w:r>
+        <w:t>}</w:t>
+      </w:r>
+      <w:proofErr w:type="gramEnd"/>
       <w:r>
         <w:br/>
         <w:t>{</w:t>
@@ -987,6 +1558,7 @@
       <w:r>
         <w:br/>
       </w:r>
+      <w:proofErr w:type="spellStart"/>
       <w:r>
         <w:rPr>
           <w:b/>
@@ -994,12 +1566,14 @@
         </w:rPr>
         <w:t>booking_id</w:t>
       </w:r>
+      <w:proofErr w:type="spellEnd"/>
       <w:r>
         <w:t xml:space="preserve"> → FK → Booking.id</w:t>
       </w:r>
       <w:r>
         <w:br/>
       </w:r>
+      <w:proofErr w:type="spellStart"/>
       <w:r>
         <w:rPr>
           <w:b/>
@@ -1007,12 +1581,14 @@
         </w:rPr>
         <w:t>seeker_id</w:t>
       </w:r>
+      <w:proofErr w:type="spellEnd"/>
       <w:r>
         <w:t xml:space="preserve"> → FK → ServiceSeeker.id</w:t>
       </w:r>
       <w:r>
         <w:br/>
       </w:r>
+      <w:proofErr w:type="spellStart"/>
       <w:r>
         <w:rPr>
           <w:b/>
@@ -1020,6 +1596,7 @@
         </w:rPr>
         <w:t>provider_id</w:t>
       </w:r>
+      <w:proofErr w:type="spellEnd"/>
       <w:r>
         <w:t xml:space="preserve"> → FK → ServiceProvider.id</w:t>
       </w:r>
@@ -1058,43 +1635,47 @@
           <w:b/>
           <w:bCs/>
         </w:rPr>
-        <w:t>1️</w:t>
-      </w:r>
-      <w:r>
-        <w:rPr>
-          <w:rFonts w:ascii="Tahoma" w:hAnsi="Tahoma" w:cs="Tahoma"/>
-          <w:b/>
-          <w:bCs/>
-        </w:rPr>
-        <w:t>⃣</w:t>
-      </w:r>
-      <w:r>
-        <w:rPr>
-          <w:b/>
-          <w:bCs/>
-        </w:rPr>
-        <w:t>2️</w:t>
-      </w:r>
-      <w:r>
-        <w:rPr>
-          <w:rFonts w:ascii="Tahoma" w:hAnsi="Tahoma" w:cs="Tahoma"/>
-          <w:b/>
-          <w:bCs/>
-        </w:rPr>
-        <w:t>⃣</w:t>
-      </w:r>
-      <w:r>
-        <w:rPr>
-          <w:b/>
-          <w:bCs/>
-        </w:rPr>
-        <w:t xml:space="preserve"> Notification</w:t>
-      </w:r>
-    </w:p>
-    <w:p>
-      <w:r>
-        <w:t>Notification {id, user_id, booking_id, message, category, is_read, created_at}</w:t>
-      </w:r>
+        <w:t>Notification</w:t>
+      </w:r>
+    </w:p>
+    <w:p>
+      <w:r>
+        <w:t xml:space="preserve">Notification {id, </w:t>
+      </w:r>
+      <w:proofErr w:type="spellStart"/>
+      <w:r>
+        <w:t>user_id</w:t>
+      </w:r>
+      <w:proofErr w:type="spellEnd"/>
+      <w:r>
+        <w:t xml:space="preserve">, </w:t>
+      </w:r>
+      <w:proofErr w:type="spellStart"/>
+      <w:r>
+        <w:t>booking_id</w:t>
+      </w:r>
+      <w:proofErr w:type="spellEnd"/>
+      <w:r>
+        <w:t xml:space="preserve">, message, category, </w:t>
+      </w:r>
+      <w:proofErr w:type="spellStart"/>
+      <w:r>
+        <w:t>is_read</w:t>
+      </w:r>
+      <w:proofErr w:type="spellEnd"/>
+      <w:r>
+        <w:t xml:space="preserve">, </w:t>
+      </w:r>
+      <w:proofErr w:type="spellStart"/>
+      <w:r>
+        <w:t>created_at</w:t>
+      </w:r>
+      <w:proofErr w:type="spellEnd"/>
+      <w:proofErr w:type="gramStart"/>
+      <w:r>
+        <w:t>}</w:t>
+      </w:r>
+      <w:proofErr w:type="gramEnd"/>
       <w:r>
         <w:br/>
         <w:t>{</w:t>
@@ -1102,6 +1683,7 @@
       <w:r>
         <w:br/>
       </w:r>
+      <w:proofErr w:type="spellStart"/>
       <w:r>
         <w:rPr>
           <w:b/>
@@ -1109,12 +1691,14 @@
         </w:rPr>
         <w:t>user_id</w:t>
       </w:r>
+      <w:proofErr w:type="spellEnd"/>
       <w:r>
         <w:t xml:space="preserve"> → FK → User.id</w:t>
       </w:r>
       <w:r>
         <w:br/>
       </w:r>
+      <w:proofErr w:type="spellStart"/>
       <w:r>
         <w:rPr>
           <w:b/>
@@ -1122,8 +1706,17 @@
         </w:rPr>
         <w:t>booking_id</w:t>
       </w:r>
-      <w:r>
-        <w:t xml:space="preserve"> → FK → Booking.id (nullable)</w:t>
+      <w:proofErr w:type="spellEnd"/>
+      <w:r>
+        <w:t xml:space="preserve"> → FK → Booking.id (</w:t>
+      </w:r>
+      <w:proofErr w:type="spellStart"/>
+      <w:r>
+        <w:t>nullable</w:t>
+      </w:r>
+      <w:proofErr w:type="spellEnd"/>
+      <w:r>
+        <w:t>)</w:t>
       </w:r>
       <w:r>
         <w:br/>
@@ -1160,43 +1753,31 @@
           <w:b/>
           <w:bCs/>
         </w:rPr>
-        <w:t>1️</w:t>
-      </w:r>
-      <w:r>
-        <w:rPr>
-          <w:rFonts w:ascii="Tahoma" w:hAnsi="Tahoma" w:cs="Tahoma"/>
-          <w:b/>
-          <w:bCs/>
-        </w:rPr>
-        <w:t>⃣</w:t>
-      </w:r>
-      <w:r>
-        <w:rPr>
-          <w:b/>
-          <w:bCs/>
-        </w:rPr>
-        <w:t>3️</w:t>
-      </w:r>
-      <w:r>
-        <w:rPr>
-          <w:rFonts w:ascii="Tahoma" w:hAnsi="Tahoma" w:cs="Tahoma"/>
-          <w:b/>
-          <w:bCs/>
-        </w:rPr>
-        <w:t>⃣</w:t>
-      </w:r>
-      <w:r>
-        <w:rPr>
-          <w:b/>
-          <w:bCs/>
-        </w:rPr>
-        <w:t xml:space="preserve"> Subscription</w:t>
-      </w:r>
-    </w:p>
-    <w:p>
-      <w:r>
-        <w:t>Subscription {id, name, price, duration_days, rank_boost}</w:t>
-      </w:r>
+        <w:t>Subscription</w:t>
+      </w:r>
+    </w:p>
+    <w:p>
+      <w:r>
+        <w:t xml:space="preserve">Subscription {id, name, price, </w:t>
+      </w:r>
+      <w:proofErr w:type="spellStart"/>
+      <w:r>
+        <w:t>duration_days</w:t>
+      </w:r>
+      <w:proofErr w:type="spellEnd"/>
+      <w:r>
+        <w:t xml:space="preserve">, </w:t>
+      </w:r>
+      <w:proofErr w:type="spellStart"/>
+      <w:r>
+        <w:t>rank_boost</w:t>
+      </w:r>
+      <w:proofErr w:type="spellEnd"/>
+      <w:proofErr w:type="gramStart"/>
+      <w:r>
+        <w:t>}</w:t>
+      </w:r>
+      <w:proofErr w:type="gramEnd"/>
       <w:r>
         <w:br/>
         <w:t>{</w:t>
@@ -1214,8 +1795,13 @@
       </w:r>
       <w:r>
         <w:br/>
-        <w:t>Used in → ProviderSubscription</w:t>
-      </w:r>
+        <w:t xml:space="preserve">Used in → </w:t>
+      </w:r>
+      <w:proofErr w:type="spellStart"/>
+      <w:r>
+        <w:t>ProviderSubscription</w:t>
+      </w:r>
+      <w:proofErr w:type="spellEnd"/>
       <w:r>
         <w:br/>
         <w:t>}</w:t>
@@ -1235,49 +1821,68 @@
           <w:bCs/>
         </w:rPr>
       </w:pPr>
-      <w:r>
-        <w:rPr>
-          <w:b/>
-          <w:bCs/>
-        </w:rPr>
-        <w:t>1️</w:t>
-      </w:r>
-      <w:r>
-        <w:rPr>
-          <w:rFonts w:ascii="Tahoma" w:hAnsi="Tahoma" w:cs="Tahoma"/>
-          <w:b/>
-          <w:bCs/>
-        </w:rPr>
-        <w:t>⃣</w:t>
-      </w:r>
-      <w:r>
-        <w:rPr>
-          <w:b/>
-          <w:bCs/>
-        </w:rPr>
-        <w:t>4️</w:t>
-      </w:r>
-      <w:r>
-        <w:rPr>
-          <w:rFonts w:ascii="Tahoma" w:hAnsi="Tahoma" w:cs="Tahoma"/>
-          <w:b/>
-          <w:bCs/>
-        </w:rPr>
-        <w:t>⃣</w:t>
-      </w:r>
-      <w:r>
-        <w:rPr>
-          <w:b/>
-          <w:bCs/>
-        </w:rPr>
-        <w:t xml:space="preserve"> ProviderSubscription</w:t>
-      </w:r>
-    </w:p>
-    <w:p>
+      <w:proofErr w:type="spellStart"/>
+      <w:r>
+        <w:rPr>
+          <w:b/>
+          <w:bCs/>
+        </w:rPr>
+        <w:t>ProviderSubscription</w:t>
+      </w:r>
+      <w:proofErr w:type="spellEnd"/>
+    </w:p>
+    <w:p>
+      <w:proofErr w:type="spellStart"/>
       <w:r>
         <w:lastRenderedPageBreak/>
-        <w:t>ProviderSubscription {id, provider_id, subscription_id, start_date, end_date, is_active}</w:t>
-      </w:r>
+        <w:t>ProviderSubscription</w:t>
+      </w:r>
+      <w:proofErr w:type="spellEnd"/>
+      <w:r>
+        <w:t xml:space="preserve"> {id, </w:t>
+      </w:r>
+      <w:proofErr w:type="spellStart"/>
+      <w:r>
+        <w:t>provider_id</w:t>
+      </w:r>
+      <w:proofErr w:type="spellEnd"/>
+      <w:r>
+        <w:t xml:space="preserve">, </w:t>
+      </w:r>
+      <w:proofErr w:type="spellStart"/>
+      <w:r>
+        <w:t>subscription_id</w:t>
+      </w:r>
+      <w:proofErr w:type="spellEnd"/>
+      <w:r>
+        <w:t xml:space="preserve">, </w:t>
+      </w:r>
+      <w:proofErr w:type="spellStart"/>
+      <w:r>
+        <w:t>start_date</w:t>
+      </w:r>
+      <w:proofErr w:type="spellEnd"/>
+      <w:r>
+        <w:t xml:space="preserve">, </w:t>
+      </w:r>
+      <w:proofErr w:type="spellStart"/>
+      <w:r>
+        <w:t>end_date</w:t>
+      </w:r>
+      <w:proofErr w:type="spellEnd"/>
+      <w:r>
+        <w:t xml:space="preserve">, </w:t>
+      </w:r>
+      <w:proofErr w:type="spellStart"/>
+      <w:r>
+        <w:t>is_active</w:t>
+      </w:r>
+      <w:proofErr w:type="spellEnd"/>
+      <w:proofErr w:type="gramStart"/>
+      <w:r>
+        <w:t>}</w:t>
+      </w:r>
+      <w:proofErr w:type="gramEnd"/>
       <w:r>
         <w:br/>
         <w:t>{</w:t>
@@ -1285,6 +1890,7 @@
       <w:r>
         <w:br/>
       </w:r>
+      <w:proofErr w:type="spellStart"/>
       <w:r>
         <w:rPr>
           <w:b/>
@@ -1292,12 +1898,14 @@
         </w:rPr>
         <w:t>provider_id</w:t>
       </w:r>
+      <w:proofErr w:type="spellEnd"/>
       <w:r>
         <w:t xml:space="preserve"> → FK → ServiceProvider.id</w:t>
       </w:r>
       <w:r>
         <w:br/>
       </w:r>
+      <w:proofErr w:type="spellStart"/>
       <w:r>
         <w:rPr>
           <w:b/>
@@ -1305,6 +1913,7 @@
         </w:rPr>
         <w:t>subscription_id</w:t>
       </w:r>
+      <w:proofErr w:type="spellEnd"/>
       <w:r>
         <w:t xml:space="preserve"> → FK → Subscription.id</w:t>
       </w:r>
@@ -1338,48 +1947,61 @@
           <w:bCs/>
         </w:rPr>
       </w:pPr>
-      <w:r>
-        <w:rPr>
-          <w:b/>
-          <w:bCs/>
-        </w:rPr>
-        <w:t>1️</w:t>
-      </w:r>
-      <w:r>
-        <w:rPr>
-          <w:rFonts w:ascii="Tahoma" w:hAnsi="Tahoma" w:cs="Tahoma"/>
-          <w:b/>
-          <w:bCs/>
-        </w:rPr>
-        <w:t>⃣</w:t>
-      </w:r>
-      <w:r>
-        <w:rPr>
-          <w:b/>
-          <w:bCs/>
-        </w:rPr>
-        <w:t>5️</w:t>
-      </w:r>
-      <w:r>
-        <w:rPr>
-          <w:rFonts w:ascii="Tahoma" w:hAnsi="Tahoma" w:cs="Tahoma"/>
-          <w:b/>
-          <w:bCs/>
-        </w:rPr>
-        <w:t>⃣</w:t>
-      </w:r>
-      <w:r>
-        <w:rPr>
-          <w:b/>
-          <w:bCs/>
-        </w:rPr>
-        <w:t xml:space="preserve"> ProviderSettings</w:t>
-      </w:r>
-    </w:p>
-    <w:p>
-      <w:r>
-        <w:t>ProviderSettings {id, provider_id, notification_enabled, auto_accept_booking, show_phone}</w:t>
-      </w:r>
+      <w:bookmarkStart w:id="0" w:name="_GoBack"/>
+      <w:bookmarkEnd w:id="0"/>
+      <w:proofErr w:type="spellStart"/>
+      <w:r>
+        <w:rPr>
+          <w:b/>
+          <w:bCs/>
+        </w:rPr>
+        <w:t>ProviderSettings</w:t>
+      </w:r>
+      <w:proofErr w:type="spellEnd"/>
+    </w:p>
+    <w:p>
+      <w:proofErr w:type="spellStart"/>
+      <w:r>
+        <w:t>ProviderSettings</w:t>
+      </w:r>
+      <w:proofErr w:type="spellEnd"/>
+      <w:r>
+        <w:t xml:space="preserve"> {id, </w:t>
+      </w:r>
+      <w:proofErr w:type="spellStart"/>
+      <w:r>
+        <w:t>provider_id</w:t>
+      </w:r>
+      <w:proofErr w:type="spellEnd"/>
+      <w:r>
+        <w:t xml:space="preserve">, </w:t>
+      </w:r>
+      <w:proofErr w:type="spellStart"/>
+      <w:r>
+        <w:t>notification_enabled</w:t>
+      </w:r>
+      <w:proofErr w:type="spellEnd"/>
+      <w:r>
+        <w:t xml:space="preserve">, </w:t>
+      </w:r>
+      <w:proofErr w:type="spellStart"/>
+      <w:r>
+        <w:t>auto_accept_booking</w:t>
+      </w:r>
+      <w:proofErr w:type="spellEnd"/>
+      <w:r>
+        <w:t xml:space="preserve">, </w:t>
+      </w:r>
+      <w:proofErr w:type="spellStart"/>
+      <w:r>
+        <w:t>show_phone</w:t>
+      </w:r>
+      <w:proofErr w:type="spellEnd"/>
+      <w:proofErr w:type="gramStart"/>
+      <w:r>
+        <w:t>}</w:t>
+      </w:r>
+      <w:proofErr w:type="gramEnd"/>
       <w:r>
         <w:br/>
         <w:t>{</w:t>
@@ -1387,6 +2009,7 @@
       <w:r>
         <w:br/>
       </w:r>
+      <w:proofErr w:type="spellStart"/>
       <w:r>
         <w:rPr>
           <w:b/>
@@ -1394,6 +2017,7 @@
         </w:rPr>
         <w:t>provider_id</w:t>
       </w:r>
+      <w:proofErr w:type="spellEnd"/>
       <w:r>
         <w:t xml:space="preserve"> → FK → ServiceProvider.id</w:t>
       </w:r>
@@ -1420,10 +2044,7 @@
         </w:pict>
       </w:r>
     </w:p>
-    <w:p>
-      <w:bookmarkStart w:id="0" w:name="_GoBack"/>
-      <w:bookmarkEnd w:id="0"/>
-    </w:p>
+    <w:p/>
     <w:p/>
     <w:p/>
     <w:p/>
@@ -1836,6 +2457,7 @@
   <w:style w:type="character" w:default="1" w:styleId="DefaultParagraphFont">
     <w:name w:val="Default Paragraph Font"/>
     <w:uiPriority w:val="1"/>
+    <w:semiHidden/>
     <w:unhideWhenUsed/>
   </w:style>
   <w:style w:type="table" w:default="1" w:styleId="TableNormal">

</xml_diff>